<commit_message>
docs: record real contest task ids
</commit_message>
<xml_diff>
--- a/回家-参赛作品完整文档.docx
+++ b/回家-参赛作品完整文档.docx
@@ -11663,7 +11663,11 @@
                 <w:rFonts w:ascii="PingFang SC" w:hAnsi="PingFang SC" w:eastAsia="PingFang SC"/>
                 <w:sz w:val="19"/>
               </w:rPr>
-              <w:t>提交前填写不少于 3 个真实 TRAE/Codex 任务 ID，不得编造</w:t>
+              <w:t>产品文档：019f5a6b-32b4-7fd1-8cec-f5e3579ebc75</w:t>
+              <w:br/>
+              <w:t>视觉算法：019f821e-7b29-7182-8c6b-f052696d4202</w:t>
+              <w:br/>
+              <w:t>App/云端/盒子联调：019f8391-5111-7773-b207-dded36176e79</w:t>
             </w:r>
           </w:p>
         </w:tc>

</xml_diff>